<commit_message>
feat: ADD EX.2 FILES AND ANSWER SHEET
</commit_message>
<xml_diff>
--- a/Answer_sheet.docx
+++ b/Answer_sheet.docx
@@ -114,18 +114,7 @@
         </w:rPr>
         <w:t xml:space="preserve"> </w:t>
       </w:r>
-    </w:p>
-    <w:p>
-      <w:pPr>
-        <w:rPr>
-          <w:rFonts w:ascii="Times New Roman" w:hAnsi="Times New Roman" w:cs="Times New Roman"/>
-          <w:sz w:val="32"/>
-          <w:szCs w:val="32"/>
-        </w:rPr>
-      </w:pPr>
-    </w:p>
-    <w:p>
-      <w:pPr>
+      <w:r>
         <w:rPr>
           <w:rFonts w:ascii="Times New Roman" w:hAnsi="Times New Roman" w:cs="Times New Roman"/>
           <w:b/>
@@ -133,8 +122,20 @@
           <w:sz w:val="32"/>
           <w:szCs w:val="32"/>
         </w:rPr>
-      </w:pPr>
-      <w:r>
+        <w:t>L01</w:t>
+      </w:r>
+    </w:p>
+    <w:p>
+      <w:pPr>
+        <w:rPr>
+          <w:rFonts w:ascii="Times New Roman" w:hAnsi="Times New Roman" w:cs="Times New Roman"/>
+          <w:sz w:val="32"/>
+          <w:szCs w:val="32"/>
+        </w:rPr>
+      </w:pPr>
+    </w:p>
+    <w:p>
+      <w:pPr>
         <w:rPr>
           <w:rFonts w:ascii="Times New Roman" w:hAnsi="Times New Roman" w:cs="Times New Roman"/>
           <w:b/>
@@ -142,17 +143,37 @@
           <w:sz w:val="32"/>
           <w:szCs w:val="32"/>
         </w:rPr>
+      </w:pPr>
+      <w:r>
+        <w:rPr>
+          <w:rFonts w:ascii="Times New Roman" w:hAnsi="Times New Roman" w:cs="Times New Roman"/>
+          <w:b/>
+          <w:bCs/>
+          <w:sz w:val="32"/>
+          <w:szCs w:val="32"/>
+        </w:rPr>
         <w:t>GitHub Link:</w:t>
       </w:r>
     </w:p>
     <w:p>
       <w:pPr>
+        <w:jc w:val="center"/>
         <w:rPr>
           <w:rFonts w:ascii="Times New Roman" w:hAnsi="Times New Roman" w:cs="Times New Roman"/>
           <w:sz w:val="32"/>
           <w:szCs w:val="32"/>
         </w:rPr>
       </w:pPr>
+      <w:hyperlink r:id="rId5" w:tgtFrame="_blank" w:tooltip="https://github.com/omaralmhf/ENSF381Lab6" w:history="1">
+        <w:r>
+          <w:rPr>
+            <w:rStyle w:val="Hyperlink"/>
+            <w:rFonts w:ascii="inherit" w:hAnsi="inherit" w:cs="Noto Sans"/>
+            <w:bdr w:val="none" w:sz="0" w:space="0" w:color="auto" w:frame="1"/>
+          </w:rPr>
+          <w:t>https://github.com/omaralmhf/ENSF381Lab6</w:t>
+        </w:r>
+      </w:hyperlink>
     </w:p>
     <w:p>
       <w:pPr>
@@ -185,23 +206,47 @@
         <w:rPr>
           <w:rFonts w:ascii="Times New Roman" w:hAnsi="Times New Roman" w:cs="Times New Roman"/>
         </w:rPr>
-        <w:t>Name 1 (UCID#)</w:t>
+        <w:t>Javier Dal Monte Casoni</w:t>
+      </w:r>
+      <w:r>
+        <w:rPr>
+          <w:rFonts w:ascii="Times New Roman" w:hAnsi="Times New Roman" w:cs="Times New Roman"/>
+        </w:rPr>
+        <w:t xml:space="preserve"> (UCID#</w:t>
+      </w:r>
+      <w:r>
+        <w:rPr>
+          <w:rFonts w:ascii="Times New Roman" w:hAnsi="Times New Roman" w:cs="Times New Roman"/>
+        </w:rPr>
+        <w:t xml:space="preserve"> 30254262</w:t>
+      </w:r>
+      <w:r>
+        <w:rPr>
+          <w:rFonts w:ascii="Times New Roman" w:hAnsi="Times New Roman" w:cs="Times New Roman"/>
+        </w:rPr>
+        <w:t>)</w:t>
       </w:r>
     </w:p>
     <w:p>
-      <w:pPr>
-        <w:rPr>
-          <w:rFonts w:ascii="Times New Roman" w:hAnsi="Times New Roman" w:cs="Times New Roman"/>
-        </w:rPr>
-      </w:pPr>
-      <w:r>
-        <w:rPr>
-          <w:rFonts w:ascii="Times New Roman" w:hAnsi="Times New Roman" w:cs="Times New Roman"/>
-        </w:rPr>
-        <w:t>Name 2 (UCID#)</w:t>
+      <w:r>
+        <w:rPr>
+          <w:rFonts w:ascii="Times New Roman" w:hAnsi="Times New Roman" w:cs="Times New Roman"/>
+        </w:rPr>
+        <w:t>Omar Al-Mahfoodh (UCID#</w:t>
+      </w:r>
+      <w:r>
+        <w:rPr>
+          <w:rFonts w:ascii="Times New Roman" w:hAnsi="Times New Roman" w:cs="Times New Roman"/>
+        </w:rPr>
+        <w:t xml:space="preserve"> </w:t>
+      </w:r>
+      <w:r>
+        <w:rPr>
+          <w:rFonts w:ascii="Times New Roman" w:hAnsi="Times New Roman" w:cs="Times New Roman"/>
+        </w:rPr>
+        <w:t>30257072)</w:t>
       </w:r>
     </w:p>
-    <w:p/>
     <w:p>
       <w:pPr>
         <w:rPr>
@@ -1229,6 +1274,18 @@
       <w:spacing w:val="5"/>
     </w:rPr>
   </w:style>
+  <w:style w:type="character" w:styleId="Hyperlink">
+    <w:name w:val="Hyperlink"/>
+    <w:basedOn w:val="DefaultParagraphFont"/>
+    <w:uiPriority w:val="99"/>
+    <w:semiHidden/>
+    <w:unhideWhenUsed/>
+    <w:rsid w:val="008E7A91"/>
+    <w:rPr>
+      <w:color w:val="0000FF"/>
+      <w:u w:val="single"/>
+    </w:rPr>
+  </w:style>
 </w:styles>
 </file>
 

</xml_diff>